<commit_message>
Hide SS Engineers entries on the 5 Fraunhofer thesis CVs
Rah asked to switch off SS Engineers and Contractors for just these 5
Fraunhofer listings, not a change to the standing default. Re-rendered
via a runtime override of SHOW_SS_ENGINEERS_EXPERIENCE (build_html.py
on disk is untouched, still defaults to True for every other role and
future runs). eRay GmbH still renders on all 5 as usual.
</commit_message>
<xml_diff>
--- a/drafts/Fraunhofer IOSB Karlsruhe Abschlussarbeit Training Data Anonymization/CV_Rahul_Rawat.docx
+++ b/drafts/Fraunhofer IOSB Karlsruhe Abschlussarbeit Training Data Anonymization/CV_Rahul_Rawat.docx
@@ -473,55 +473,6 @@
     </w:p>
     <w:p>
       <w:pPr>
-        <w:spacing w:before="20" w:after="0"/>
-      </w:pPr>
-      <w:r>
-        <w:rPr>
-          <w:b/>
-          <w:color w:val="B8663F"/>
-          <w:sz w:val="19"/>
-        </w:rPr>
-        <w:t xml:space="preserve">Technologies: </w:t>
-      </w:r>
-      <w:r>
-        <w:rPr>
-          <w:i/>
-          <w:color w:val="6C7A93"/>
-          <w:sz w:val="19"/>
-        </w:rPr>
-        <w:t>Python, CatBoost, Prophet, scikit learn, MICE</w:t>
-      </w:r>
-    </w:p>
-    <w:p>
-      <w:pPr>
-        <w:keepNext/>
-        <w:spacing w:before="40" w:after="0" w:line="276" w:lineRule="auto"/>
-      </w:pPr>
-      <w:r>
-        <w:rPr>
-          <w:b/>
-          <w:color w:val="1F3A5F"/>
-          <w:sz w:val="22"/>
-        </w:rPr>
-        <w:t>SS Engineers and Contractors</w:t>
-      </w:r>
-    </w:p>
-    <w:p>
-      <w:pPr>
-        <w:keepNext/>
-        <w:spacing w:before="0" w:after="0" w:line="276" w:lineRule="auto"/>
-      </w:pPr>
-      <w:r>
-        <w:rPr>
-          <w:i/>
-          <w:color w:val="6C7A93"/>
-          <w:sz w:val="20"/>
-        </w:rPr>
-        <w:t>Junior Associate Software Developer · India · Aug 2023 bis Aug 2024</w:t>
-      </w:r>
-    </w:p>
-    <w:p>
-      <w:pPr>
         <w:spacing w:before="0" w:after="0" w:line="276" w:lineRule="auto"/>
         <w:ind w:left="283" w:hanging="170"/>
         <w:jc w:val="both"/>
@@ -540,7 +491,151 @@
           <w:color w:val="1F2937"/>
           <w:sz w:val="21"/>
         </w:rPr>
-        <w:t>Da SS Engineers and Contractors interne Data Dashboards, Analytics Plattformen und Mitarbeiter Portale betreibt, die unternehmensweit genutzt werden, mit dem Auftrag die Frontend Features zu bauen und zu pflegen, auf die die Teams im Alltag angewiesen sind, wurden React UI Komponenten in allen drei internen Produkten beigetragen, die während des gesamten Jahres in der Rolle im täglichen Einsatz der internen Teams blieben.</w:t>
+        <w:t xml:space="preserve">Die September Evaluation wurde belastbar gemacht mit einem </w:t>
+      </w:r>
+      <w:r>
+        <w:rPr>
+          <w:b/>
+          <w:color w:val="1F3A5F"/>
+          <w:sz w:val="21"/>
+        </w:rPr>
+        <w:t>3 Pass</w:t>
+      </w:r>
+      <w:r>
+        <w:rPr>
+          <w:b w:val="0"/>
+          <w:color w:val="1F2937"/>
+          <w:sz w:val="21"/>
+        </w:rPr>
+        <w:t xml:space="preserve"> Outlier System pH verengt von </w:t>
+      </w:r>
+      <w:r>
+        <w:rPr>
+          <w:b/>
+          <w:color w:val="1F3A5F"/>
+          <w:sz w:val="21"/>
+        </w:rPr>
+        <w:t>0 bis 14</w:t>
+      </w:r>
+      <w:r>
+        <w:rPr>
+          <w:b w:val="0"/>
+          <w:color w:val="1F2937"/>
+          <w:sz w:val="21"/>
+        </w:rPr>
+        <w:t xml:space="preserve"> auf </w:t>
+      </w:r>
+      <w:r>
+        <w:rPr>
+          <w:b/>
+          <w:color w:val="1F3A5F"/>
+          <w:sz w:val="21"/>
+        </w:rPr>
+        <w:t>7.0 bis 9.0</w:t>
+      </w:r>
+      <w:r>
+        <w:rPr>
+          <w:b w:val="0"/>
+          <w:color w:val="1F2937"/>
+          <w:sz w:val="21"/>
+        </w:rPr>
+        <w:t xml:space="preserve">, Oct und Nov Caps von </w:t>
+      </w:r>
+      <w:r>
+        <w:rPr>
+          <w:b/>
+          <w:color w:val="1F3A5F"/>
+          <w:sz w:val="21"/>
+        </w:rPr>
+        <w:t>15.0</w:t>
+      </w:r>
+      <w:r>
+        <w:rPr>
+          <w:b w:val="0"/>
+          <w:color w:val="1F2937"/>
+          <w:sz w:val="21"/>
+        </w:rPr>
+        <w:t xml:space="preserve"> bei Chlorophyll a und </w:t>
+      </w:r>
+      <w:r>
+        <w:rPr>
+          <w:b/>
+          <w:color w:val="1F3A5F"/>
+          <w:sz w:val="21"/>
+        </w:rPr>
+        <w:t>50.0</w:t>
+      </w:r>
+      <w:r>
+        <w:rPr>
+          <w:b w:val="0"/>
+          <w:color w:val="1F2937"/>
+          <w:sz w:val="21"/>
+        </w:rPr>
+        <w:t xml:space="preserve"> bei Trübung, ein rollender z-score bei z&gt;</w:t>
+      </w:r>
+      <w:r>
+        <w:rPr>
+          <w:b/>
+          <w:color w:val="1F3A5F"/>
+          <w:sz w:val="21"/>
+        </w:rPr>
+        <w:t>2.5</w:t>
+      </w:r>
+      <w:r>
+        <w:rPr>
+          <w:b w:val="0"/>
+          <w:color w:val="1F2937"/>
+          <w:sz w:val="21"/>
+        </w:rPr>
+        <w:t xml:space="preserve"> über </w:t>
+      </w:r>
+      <w:r>
+        <w:rPr>
+          <w:b/>
+          <w:color w:val="1F3A5F"/>
+          <w:sz w:val="21"/>
+        </w:rPr>
+        <w:t>48 Stunden</w:t>
+      </w:r>
+      <w:r>
+        <w:rPr>
+          <w:b w:val="0"/>
+          <w:color w:val="1F2937"/>
+          <w:sz w:val="21"/>
+        </w:rPr>
+        <w:t xml:space="preserve">, und 5 spärliche Sensoren plus 3 zeitgleiche Proxies phycocyanin_abs, phycocyanin_abs_comp und toc wurden ausgeschlossen, was die ehrliche R quadrat Aufteilung von </w:t>
+      </w:r>
+      <w:r>
+        <w:rPr>
+          <w:b/>
+          <w:color w:val="1F3A5F"/>
+          <w:sz w:val="21"/>
+        </w:rPr>
+        <w:t>0.86</w:t>
+      </w:r>
+      <w:r>
+        <w:rPr>
+          <w:b w:val="0"/>
+          <w:color w:val="1F2937"/>
+          <w:sz w:val="21"/>
+        </w:rPr>
+        <w:t xml:space="preserve"> bei gelöstem Sauerstoff und </w:t>
+      </w:r>
+      <w:r>
+        <w:rPr>
+          <w:b/>
+          <w:color w:val="1F3A5F"/>
+          <w:sz w:val="21"/>
+        </w:rPr>
+        <w:t>0.81</w:t>
+      </w:r>
+      <w:r>
+        <w:rPr>
+          <w:b w:val="0"/>
+          <w:color w:val="1F2937"/>
+          <w:sz w:val="21"/>
+        </w:rPr>
+        <w:t xml:space="preserve"> bei pH offenlegte.</w:t>
       </w:r>
     </w:p>
     <w:p>
@@ -561,79 +656,7 @@
           <w:color w:val="6C7A93"/>
           <w:sz w:val="19"/>
         </w:rPr>
-        <w:t>React, module federation, Playwright, AngularJS, HTML5, CSS3</w:t>
-      </w:r>
-    </w:p>
-    <w:p>
-      <w:pPr>
-        <w:keepNext/>
-        <w:spacing w:before="40" w:after="0" w:line="276" w:lineRule="auto"/>
-      </w:pPr>
-      <w:r>
-        <w:rPr>
-          <w:b/>
-          <w:color w:val="1F3A5F"/>
-          <w:sz w:val="22"/>
-        </w:rPr>
-        <w:t>SS Engineers and Contractors</w:t>
-      </w:r>
-    </w:p>
-    <w:p>
-      <w:pPr>
-        <w:keepNext/>
-        <w:spacing w:before="0" w:after="0" w:line="276" w:lineRule="auto"/>
-      </w:pPr>
-      <w:r>
-        <w:rPr>
-          <w:i/>
-          <w:color w:val="6C7A93"/>
-          <w:sz w:val="20"/>
-        </w:rPr>
-        <w:t>Front End Developer Intern · India · Feb 2023 bis Juli 2023</w:t>
-      </w:r>
-    </w:p>
-    <w:p>
-      <w:pPr>
-        <w:spacing w:before="0" w:after="0" w:line="276" w:lineRule="auto"/>
-        <w:ind w:left="283" w:hanging="170"/>
-        <w:jc w:val="both"/>
-      </w:pPr>
-      <w:r>
-        <w:rPr>
-          <w:b/>
-          <w:color w:val="B8663F"/>
-          <w:sz w:val="21"/>
-        </w:rPr>
-        <w:t xml:space="preserve">• </w:t>
-      </w:r>
-      <w:r>
-        <w:rPr>
-          <w:b w:val="0"/>
-          <w:color w:val="1F2937"/>
-          <w:sz w:val="21"/>
-        </w:rPr>
-        <w:t>Während eines sechsmonatigen Praktikums bei SS Engineers and Contractors, mit dem Auftrag die Codebasis kennenzulernen und dann unter Senior Review kleinere UI Arbeiten in den internen Data Dashboards und Mitarbeiter Portalen zu übernehmen, wurde eng mit Senior Entwicklern durch die Codebasis gegangen und anschließend wurden fokussierte UI Komponenten wie Charts, Filter und Profilseiten geliefert, jede iterativ auf Basis von Code Review Feedback verbessert bis sie freigegeben war.</w:t>
-      </w:r>
-    </w:p>
-    <w:p>
-      <w:pPr>
-        <w:spacing w:before="20" w:after="0"/>
-      </w:pPr>
-      <w:r>
-        <w:rPr>
-          <w:b/>
-          <w:color w:val="B8663F"/>
-          <w:sz w:val="19"/>
-        </w:rPr>
-        <w:t xml:space="preserve">Technologies: </w:t>
-      </w:r>
-      <w:r>
-        <w:rPr>
-          <w:i/>
-          <w:color w:val="6C7A93"/>
-          <w:sz w:val="19"/>
-        </w:rPr>
-        <w:t>React, HTML5, CSS3, Git, code review workflow</w:t>
+        <w:t>Python, CatBoost, Prophet, scikit learn, MICE</w:t>
       </w:r>
     </w:p>
     <w:p>
@@ -939,6 +962,91 @@
     </w:p>
     <w:p>
       <w:pPr>
+        <w:spacing w:before="0" w:after="0" w:line="276" w:lineRule="auto"/>
+        <w:ind w:left="283" w:hanging="170"/>
+        <w:jc w:val="both"/>
+      </w:pPr>
+      <w:r>
+        <w:rPr>
+          <w:b/>
+          <w:color w:val="B8663F"/>
+          <w:sz w:val="21"/>
+        </w:rPr>
+        <w:t xml:space="preserve">• </w:t>
+      </w:r>
+      <w:r>
+        <w:rPr>
+          <w:b w:val="0"/>
+          <w:color w:val="1F2937"/>
+          <w:sz w:val="21"/>
+        </w:rPr>
+        <w:t>Nach dem Erkennen biologisch unmöglicher Nullwerte in den Quelldaten, die die Originalautoren übersehen hatten, mit dem Auftrag die Datenintegrität vor jedem Modelltraining wiederherzustellen, wurde eine IQR basierte Ausreißerbehandlung und saubere Imputation angewandt, was den Datensatz von still fehlerhaft zu einer sauberen Trainingsgrundlage für jedes nachgelagerte Modell brachte.</w:t>
+      </w:r>
+    </w:p>
+    <w:p>
+      <w:pPr>
+        <w:spacing w:before="0" w:after="0" w:line="276" w:lineRule="auto"/>
+        <w:ind w:left="283" w:hanging="170"/>
+        <w:jc w:val="both"/>
+      </w:pPr>
+      <w:r>
+        <w:rPr>
+          <w:b/>
+          <w:color w:val="B8663F"/>
+          <w:sz w:val="21"/>
+        </w:rPr>
+        <w:t xml:space="preserve">• </w:t>
+      </w:r>
+      <w:r>
+        <w:rPr>
+          <w:b w:val="0"/>
+          <w:color w:val="1F2937"/>
+          <w:sz w:val="21"/>
+        </w:rPr>
+        <w:t xml:space="preserve">Bei einer 65 zu </w:t>
+      </w:r>
+      <w:r>
+        <w:rPr>
+          <w:b/>
+          <w:color w:val="1F3A5F"/>
+          <w:sz w:val="21"/>
+        </w:rPr>
+        <w:t>35 Klassen</w:t>
+      </w:r>
+      <w:r>
+        <w:rPr>
+          <w:b w:val="0"/>
+          <w:color w:val="1F2937"/>
+          <w:sz w:val="21"/>
+        </w:rPr>
+        <w:t>ungleichgewicht Verteilung, die Genauigkeit zu einer trügerisch schönen Leitmetrik gemacht hätte, mit dem Auftrag eine Bewertung zu wählen, die Fehler in der Minderheitsklasse nicht verdeckt, wurde die Leitmetrik von Genauigkeit auf ROC AUC umgestellt, was die realen Fehlermuster offenlegte, die die Genauigkeitszahl maskiert hatte und der Arbeit einen ehrlichen Leistungsvergleich gab.</w:t>
+      </w:r>
+    </w:p>
+    <w:p>
+      <w:pPr>
+        <w:spacing w:before="0" w:after="0" w:line="276" w:lineRule="auto"/>
+        <w:ind w:left="283" w:hanging="170"/>
+        <w:jc w:val="both"/>
+      </w:pPr>
+      <w:r>
+        <w:rPr>
+          <w:b/>
+          <w:color w:val="B8663F"/>
+          <w:sz w:val="21"/>
+        </w:rPr>
+        <w:t xml:space="preserve">• </w:t>
+      </w:r>
+      <w:r>
+        <w:rPr>
+          <w:b w:val="0"/>
+          <w:color w:val="1F2937"/>
+          <w:sz w:val="21"/>
+        </w:rPr>
+        <w:t>Da die Ergebnisse in der Substanz veröffentlichungsreif und nicht nur abgabefähig sein sollten, mit dem Auftrag sie formal aufzuschreiben, wurde ein IEEE Paper mit einem ehrlichen Abschnitt zu Grenzen und Verbesserungsvorschlägen für eine Folgestudie verfasst, das der Betreuer als in der Substanz veröffentlichungsreif akzeptierte.</w:t>
+      </w:r>
+    </w:p>
+    <w:p>
+      <w:pPr>
         <w:spacing w:before="20" w:after="0"/>
       </w:pPr>
       <w:r>
@@ -995,6 +1103,50 @@
           <w:sz w:val="21"/>
         </w:rPr>
         <w:t>NVIDIA: Building LLM Applications With Prompt Engineering, ausgestellt im November 2025.</w:t>
+      </w:r>
+    </w:p>
+    <w:p>
+      <w:pPr>
+        <w:spacing w:before="0" w:after="0" w:line="252" w:lineRule="auto"/>
+        <w:ind w:left="170"/>
+      </w:pPr>
+      <w:r>
+        <w:rPr>
+          <w:b/>
+          <w:color w:val="B8663F"/>
+          <w:sz w:val="21"/>
+        </w:rPr>
+        <w:t xml:space="preserve">• </w:t>
+      </w:r>
+      <w:r>
+        <w:rPr>
+          <w:b w:val="0"/>
+          <w:color w:val="1F2937"/>
+          <w:sz w:val="21"/>
+        </w:rPr>
+        <w:t>AWS Academy Graduate: AWS Academy Cloud Foundations, ausgestellt im Juli 2025.</w:t>
+      </w:r>
+    </w:p>
+    <w:p>
+      <w:pPr>
+        <w:spacing w:before="0" w:after="0" w:line="252" w:lineRule="auto"/>
+        <w:ind w:left="170"/>
+      </w:pPr>
+      <w:r>
+        <w:rPr>
+          <w:b/>
+          <w:color w:val="B8663F"/>
+          <w:sz w:val="21"/>
+        </w:rPr>
+        <w:t xml:space="preserve">• </w:t>
+      </w:r>
+      <w:r>
+        <w:rPr>
+          <w:b w:val="0"/>
+          <w:color w:val="1F2937"/>
+          <w:sz w:val="21"/>
+        </w:rPr>
+        <w:t>Google Data Analytics: Foundations, Data, Data, Everywhere, ausgestellt im April 2025 auf Coursera.</w:t>
       </w:r>
     </w:p>
     <w:p>

</xml_diff>